<commit_message>
Stockage : volume Docker chiffré à la place de MinIO (images retirées)
`docker compose up` échouait : « pull access denied for minio/minio ». MinIO a archivé
son édition communautaire et retiré ses images de Docker Hub (septembre 2026).

- docker-compose.yml : service minio supprimé ; api et worker partagent le volume
  « storage » (SIGED_STORAGE_BACKEND=local, fichiers toujours chiffrés AES-256-GCM)
- Dockerfile : /data/storage et /data/inbox créés pour l'utilisateur siged
- sauvegarde : archive du volume de fichiers au lieu des objets MinIO ; restauration adaptée
- caddy:2-alpine (étiquette stable)
- generer_secrets.py, guide_secrets.md, deploiement_oracle.md, README : plus de variables MinIO ;
  option S3 externe (R2, Garage, AWS) documentée
- cahier d'architecture : ADR-07, diagrammes et exports DOCX/PDF mis à jour

Co-Authored-By: Claude Opus 5.5 <noreply@anthropic.com>
Claude-Session: https://claude.ai/code/session_01MrcaY2SYLf8LqXKFnsT8Uf
</commit_message>
<xml_diff>
--- a/docs/Cahier_Architecture_SIGED.docx
+++ b/docs/Cahier_Architecture_SIGED.docx
@@ -1384,17 +1384,7 @@
               <w:jc w:val="left"/>
             </w:pPr>
             <w:r>
-              <w:rPr>
-                <w:bCs/>
-                <w:b/>
-              </w:rPr>
-              <w:t xml:space="preserve">MinIO</w:t>
-            </w:r>
-            <w:r>
-              <w:t xml:space="preserve"> </w:t>
-            </w:r>
-            <w:r>
-              <w:t xml:space="preserve">(compatible S3) ou système de fichiers</w:t>
+              <w:t xml:space="preserve">Système de fichiers sur volume dédié (défaut) ou stockage objet compatible S3 (Garage, Cloudflare R2, AWS S3…)</w:t>
             </w:r>
           </w:p>
         </w:tc>
@@ -1837,6 +1827,49 @@
           <w:bCs/>
           <w:b/>
         </w:rPr>
+        <w:t xml:space="preserve">ADR-07 — Stockage sur système de fichiers chiffré plutôt que MinIO (révision d’octobre 2026).</w:t>
+      </w:r>
+      <w:r>
+        <w:t xml:space="preserve"> </w:t>
+      </w:r>
+      <w:r>
+        <w:t xml:space="preserve">MinIO a archivé son projet communautaire et retiré ses images Docker en septembre 2026 : le service ne pouvait plus être déployé. Le cahier des charges autorise « Object Storage / système de fichiers ». SIGED stocke donc par défaut ses fichiers sur un</w:t>
+      </w:r>
+      <w:r>
+        <w:t xml:space="preserve"> </w:t>
+      </w:r>
+      <w:r>
+        <w:rPr>
+          <w:bCs/>
+          <w:b/>
+        </w:rPr>
+        <w:t xml:space="preserve">volume dédié</w:t>
+      </w:r>
+      <w:r>
+        <w:t xml:space="preserve">, séparé de la base, et toujours chiffrés par l’application (ADR-03). Cela fait un service de moins à exploiter et sécuriser. Grâce à l’abstraction</w:t>
+      </w:r>
+      <w:r>
+        <w:t xml:space="preserve"> </w:t>
+      </w:r>
+      <w:r>
+        <w:rPr>
+          <w:rStyle w:val="VerbatimChar"/>
+        </w:rPr>
+        <w:t xml:space="preserve">StorageBackend</w:t>
+      </w:r>
+      <w:r>
+        <w:t xml:space="preserve">, il suffit d’une variable pour passer à un stockage objet compatible S3 (Garage, Cloudflare R2, AWS S3) lorsque le volume ou la haute disponibilité l’exigeront.</w:t>
+      </w:r>
+    </w:p>
+    <w:p>
+      <w:pPr>
+        <w:pStyle w:val="BodyText"/>
+      </w:pPr>
+      <w:r>
+        <w:rPr>
+          <w:bCs/>
+          <w:b/>
+        </w:rPr>
         <w:t xml:space="preserve">ADR-04 — OCRmyPDF plutôt qu’Apache Tika.</w:t>
       </w:r>
       <w:r>
@@ -1988,7 +2021,7 @@
       <w:r>
         <w:drawing>
           <wp:inline>
-            <wp:extent cx="5334000" cy="3268231"/>
+            <wp:extent cx="5334000" cy="3156463"/>
             <wp:effectExtent b="0" l="0" r="0" t="0"/>
             <wp:docPr descr="Architecture technique" title="" id="26" name="Picture"/>
             <a:graphic>
@@ -2009,7 +2042,7 @@
                   <pic:spPr bwMode="auto">
                     <a:xfrm>
                       <a:off x="0" y="0"/>
-                      <a:ext cx="5334000" cy="3268231"/>
+                      <a:ext cx="5334000" cy="3156463"/>
                     </a:xfrm>
                     <a:prstGeom prst="rect">
                       <a:avLst/>
@@ -2139,7 +2172,7 @@
         <w:t xml:space="preserve"> </w:t>
       </w:r>
       <w:r>
-        <w:t xml:space="preserve">— PostgreSQL contient métadonnées, index, droits et traces ; MinIO contient les fichiers chiffrés. Les deux sont sauvegardés chaque jour.</w:t>
+        <w:t xml:space="preserve">— PostgreSQL contient métadonnées, index, droits et traces ; un volume de stockage séparé contient les fichiers chiffrés. Les deux sont sauvegardés chaque jour.</w:t>
       </w:r>
     </w:p>
     <w:bookmarkEnd w:id="28"/>
@@ -3737,7 +3770,7 @@
       <w:r>
         <w:drawing>
           <wp:inline>
-            <wp:extent cx="5067300" cy="2447275"/>
+            <wp:extent cx="5067300" cy="2445777"/>
             <wp:effectExtent b="0" l="0" r="0" t="0"/>
             <wp:docPr descr="Séquence de dépôt" title="" id="37" name="Picture"/>
             <a:graphic>
@@ -3758,7 +3791,7 @@
                   <pic:spPr bwMode="auto">
                     <a:xfrm>
                       <a:off x="0" y="0"/>
-                      <a:ext cx="5067300" cy="2447275"/>
+                      <a:ext cx="5067300" cy="2445777"/>
                     </a:xfrm>
                     <a:prstGeom prst="rect">
                       <a:avLst/>
@@ -6693,13 +6726,28 @@
           <w:bCs/>
           <w:b/>
         </w:rPr>
-        <w:t xml:space="preserve">MinIO distribué</w:t>
-      </w:r>
-      <w:r>
-        <w:t xml:space="preserve"> </w:t>
-      </w:r>
-      <w:r>
-        <w:t xml:space="preserve">(4 nœuds minimum, codage à effacement) : tolère la perte d’un nœud ou de disques.</w:t>
+        <w:t xml:space="preserve">Stockage objet distribué</w:t>
+      </w:r>
+      <w:r>
+        <w:t xml:space="preserve"> </w:t>
+      </w:r>
+      <w:r>
+        <w:t xml:space="preserve">compatible S3 (Garage, Ceph RGW… ; 3 nœuds minimum avec réplication) : tolère la perte d’un nœud ou de disques. Le backend</w:t>
+      </w:r>
+      <w:r>
+        <w:t xml:space="preserve"> </w:t>
+      </w:r>
+      <w:r>
+        <w:rPr>
+          <w:rStyle w:val="VerbatimChar"/>
+        </w:rPr>
+        <w:t xml:space="preserve">s3</w:t>
+      </w:r>
+      <w:r>
+        <w:t xml:space="preserve"> </w:t>
+      </w:r>
+      <w:r>
+        <w:t xml:space="preserve">de SIGED s’y connecte sans changement de code.</w:t>
       </w:r>
     </w:p>
     <w:p>
@@ -6800,7 +6848,7 @@
         <w:t xml:space="preserve"> </w:t>
       </w:r>
       <w:r>
-        <w:t xml:space="preserve">(format personnalisé) + archive des objets MinIO (déjà chiffrés), fichier</w:t>
+        <w:t xml:space="preserve">(format personnalisé) + archive du volume de fichiers (déjà chiffrés), fichier</w:t>
       </w:r>
       <w:r>
         <w:t xml:space="preserve"> </w:t>

</xml_diff>

<commit_message>
Revert "Stockage : volume Docker chiffré à la place de MinIO (images retirées)"
This reverts commit d797858b800714bc5be745c2ac1ea8c556dd790b.
</commit_message>
<xml_diff>
--- a/docs/Cahier_Architecture_SIGED.docx
+++ b/docs/Cahier_Architecture_SIGED.docx
@@ -1384,7 +1384,17 @@
               <w:jc w:val="left"/>
             </w:pPr>
             <w:r>
-              <w:t xml:space="preserve">Système de fichiers sur volume dédié (défaut) ou stockage objet compatible S3 (Garage, Cloudflare R2, AWS S3…)</w:t>
+              <w:rPr>
+                <w:bCs/>
+                <w:b/>
+              </w:rPr>
+              <w:t xml:space="preserve">MinIO</w:t>
+            </w:r>
+            <w:r>
+              <w:t xml:space="preserve"> </w:t>
+            </w:r>
+            <w:r>
+              <w:t xml:space="preserve">(compatible S3) ou système de fichiers</w:t>
             </w:r>
           </w:p>
         </w:tc>
@@ -1827,49 +1837,6 @@
           <w:bCs/>
           <w:b/>
         </w:rPr>
-        <w:t xml:space="preserve">ADR-07 — Stockage sur système de fichiers chiffré plutôt que MinIO (révision d’octobre 2026).</w:t>
-      </w:r>
-      <w:r>
-        <w:t xml:space="preserve"> </w:t>
-      </w:r>
-      <w:r>
-        <w:t xml:space="preserve">MinIO a archivé son projet communautaire et retiré ses images Docker en septembre 2026 : le service ne pouvait plus être déployé. Le cahier des charges autorise « Object Storage / système de fichiers ». SIGED stocke donc par défaut ses fichiers sur un</w:t>
-      </w:r>
-      <w:r>
-        <w:t xml:space="preserve"> </w:t>
-      </w:r>
-      <w:r>
-        <w:rPr>
-          <w:bCs/>
-          <w:b/>
-        </w:rPr>
-        <w:t xml:space="preserve">volume dédié</w:t>
-      </w:r>
-      <w:r>
-        <w:t xml:space="preserve">, séparé de la base, et toujours chiffrés par l’application (ADR-03). Cela fait un service de moins à exploiter et sécuriser. Grâce à l’abstraction</w:t>
-      </w:r>
-      <w:r>
-        <w:t xml:space="preserve"> </w:t>
-      </w:r>
-      <w:r>
-        <w:rPr>
-          <w:rStyle w:val="VerbatimChar"/>
-        </w:rPr>
-        <w:t xml:space="preserve">StorageBackend</w:t>
-      </w:r>
-      <w:r>
-        <w:t xml:space="preserve">, il suffit d’une variable pour passer à un stockage objet compatible S3 (Garage, Cloudflare R2, AWS S3) lorsque le volume ou la haute disponibilité l’exigeront.</w:t>
-      </w:r>
-    </w:p>
-    <w:p>
-      <w:pPr>
-        <w:pStyle w:val="BodyText"/>
-      </w:pPr>
-      <w:r>
-        <w:rPr>
-          <w:bCs/>
-          <w:b/>
-        </w:rPr>
         <w:t xml:space="preserve">ADR-04 — OCRmyPDF plutôt qu’Apache Tika.</w:t>
       </w:r>
       <w:r>
@@ -2021,7 +1988,7 @@
       <w:r>
         <w:drawing>
           <wp:inline>
-            <wp:extent cx="5334000" cy="3156463"/>
+            <wp:extent cx="5334000" cy="3268231"/>
             <wp:effectExtent b="0" l="0" r="0" t="0"/>
             <wp:docPr descr="Architecture technique" title="" id="26" name="Picture"/>
             <a:graphic>
@@ -2042,7 +2009,7 @@
                   <pic:spPr bwMode="auto">
                     <a:xfrm>
                       <a:off x="0" y="0"/>
-                      <a:ext cx="5334000" cy="3156463"/>
+                      <a:ext cx="5334000" cy="3268231"/>
                     </a:xfrm>
                     <a:prstGeom prst="rect">
                       <a:avLst/>
@@ -2172,7 +2139,7 @@
         <w:t xml:space="preserve"> </w:t>
       </w:r>
       <w:r>
-        <w:t xml:space="preserve">— PostgreSQL contient métadonnées, index, droits et traces ; un volume de stockage séparé contient les fichiers chiffrés. Les deux sont sauvegardés chaque jour.</w:t>
+        <w:t xml:space="preserve">— PostgreSQL contient métadonnées, index, droits et traces ; MinIO contient les fichiers chiffrés. Les deux sont sauvegardés chaque jour.</w:t>
       </w:r>
     </w:p>
     <w:bookmarkEnd w:id="28"/>
@@ -3770,7 +3737,7 @@
       <w:r>
         <w:drawing>
           <wp:inline>
-            <wp:extent cx="5067300" cy="2445777"/>
+            <wp:extent cx="5067300" cy="2447275"/>
             <wp:effectExtent b="0" l="0" r="0" t="0"/>
             <wp:docPr descr="Séquence de dépôt" title="" id="37" name="Picture"/>
             <a:graphic>
@@ -3791,7 +3758,7 @@
                   <pic:spPr bwMode="auto">
                     <a:xfrm>
                       <a:off x="0" y="0"/>
-                      <a:ext cx="5067300" cy="2445777"/>
+                      <a:ext cx="5067300" cy="2447275"/>
                     </a:xfrm>
                     <a:prstGeom prst="rect">
                       <a:avLst/>
@@ -6726,28 +6693,13 @@
           <w:bCs/>
           <w:b/>
         </w:rPr>
-        <w:t xml:space="preserve">Stockage objet distribué</w:t>
-      </w:r>
-      <w:r>
-        <w:t xml:space="preserve"> </w:t>
-      </w:r>
-      <w:r>
-        <w:t xml:space="preserve">compatible S3 (Garage, Ceph RGW… ; 3 nœuds minimum avec réplication) : tolère la perte d’un nœud ou de disques. Le backend</w:t>
-      </w:r>
-      <w:r>
-        <w:t xml:space="preserve"> </w:t>
-      </w:r>
-      <w:r>
-        <w:rPr>
-          <w:rStyle w:val="VerbatimChar"/>
-        </w:rPr>
-        <w:t xml:space="preserve">s3</w:t>
-      </w:r>
-      <w:r>
-        <w:t xml:space="preserve"> </w:t>
-      </w:r>
-      <w:r>
-        <w:t xml:space="preserve">de SIGED s’y connecte sans changement de code.</w:t>
+        <w:t xml:space="preserve">MinIO distribué</w:t>
+      </w:r>
+      <w:r>
+        <w:t xml:space="preserve"> </w:t>
+      </w:r>
+      <w:r>
+        <w:t xml:space="preserve">(4 nœuds minimum, codage à effacement) : tolère la perte d’un nœud ou de disques.</w:t>
       </w:r>
     </w:p>
     <w:p>
@@ -6848,7 +6800,7 @@
         <w:t xml:space="preserve"> </w:t>
       </w:r>
       <w:r>
-        <w:t xml:space="preserve">(format personnalisé) + archive du volume de fichiers (déjà chiffrés), fichier</w:t>
+        <w:t xml:space="preserve">(format personnalisé) + archive des objets MinIO (déjà chiffrés), fichier</w:t>
       </w:r>
       <w:r>
         <w:t xml:space="preserve"> </w:t>

</xml_diff>